<commit_message>
repaired a few mobile issues in design
</commit_message>
<xml_diff>
--- a/texte/BA.docx
+++ b/texte/BA.docx
@@ -43,10 +43,12 @@
         <w:t xml:space="preserve"> von </w:t>
       </w:r>
       <w:proofErr w:type="spellStart"/>
+      <w:proofErr w:type="gramStart"/>
       <w:r>
         <w:t>Musiker:innen</w:t>
       </w:r>
       <w:proofErr w:type="spellEnd"/>
+      <w:proofErr w:type="gramEnd"/>
       <w:r>
         <w:t xml:space="preserve"> in ihrem Songwriting-Prozess mittels Entwicklung einer Digital Audio Workstation und eines Tools zur Erstellung von Leadsheets.</w:t>
       </w:r>
@@ -239,7 +241,21 @@
         <w:rPr>
           <w:lang w:val="en-GB"/>
         </w:rPr>
-        <w:t xml:space="preserve">The surveys and planning which functionalities finally have to go in, I implemented with my fellow student and friend Christina Klee. She wrote her bachelor thesis on the same topic, except that she implemented the design instead of the technology in the back part of her thesis. However, this </w:t>
+        <w:t xml:space="preserve">The surveys and planning which functionalities finally </w:t>
+      </w:r>
+      <w:proofErr w:type="gramStart"/>
+      <w:r>
+        <w:rPr>
+          <w:lang w:val="en-GB"/>
+        </w:rPr>
+        <w:t>have to</w:t>
+      </w:r>
+      <w:proofErr w:type="gramEnd"/>
+      <w:r>
+        <w:rPr>
+          <w:lang w:val="en-GB"/>
+        </w:rPr>
+        <w:t xml:space="preserve"> go in, I implemented with my fellow student and friend Christina Klee. She wrote her bachelor thesis on the same topic, except that she implemented the design instead of the technology in the back part of her thesis. However, this </w:t>
       </w:r>
       <w:r>
         <w:rPr>
@@ -714,7 +730,14 @@
           <w:bCs/>
         </w:rPr>
         <w:lastRenderedPageBreak/>
-        <w:t>Ausgenommen sind Spielekonsolen und Smart-</w:t>
+        <w:t xml:space="preserve">Ausgenommen sind Spielekonsolen und </w:t>
+      </w:r>
+      <w:proofErr w:type="gramStart"/>
+      <w:r>
+        <w:rPr>
+          <w:bCs/>
+        </w:rPr>
+        <w:t>Smart-</w:t>
       </w:r>
       <w:proofErr w:type="spellStart"/>
       <w:r>
@@ -724,6 +747,7 @@
         <w:t>TV’s</w:t>
       </w:r>
       <w:proofErr w:type="spellEnd"/>
+      <w:proofErr w:type="gramEnd"/>
       <w:r>
         <w:rPr>
           <w:bCs/>
@@ -773,7 +797,21 @@
         <w:rPr>
           <w:lang w:val="en-GB"/>
         </w:rPr>
-        <w:t>Unfortunately, this can only be relied on to a limited extent, since Apple is reluctant to use this technology. Thus, this variant is also optimized for Android. However, MacOS users can also use the program, albeit with possible restrictions. However, I hope that the PWA will experience its breakthrough in the next few years and that Apple will be forced to support this technology more and more.</w:t>
+        <w:t xml:space="preserve">Unfortunately, this can only be relied on to a limited </w:t>
+      </w:r>
+      <w:proofErr w:type="gramStart"/>
+      <w:r>
+        <w:rPr>
+          <w:lang w:val="en-GB"/>
+        </w:rPr>
+        <w:t>extent, since</w:t>
+      </w:r>
+      <w:proofErr w:type="gramEnd"/>
+      <w:r>
+        <w:rPr>
+          <w:lang w:val="en-GB"/>
+        </w:rPr>
+        <w:t xml:space="preserve"> Apple is reluctant to use this technology. Thus, this variant is also optimized for Android. However, MacOS users can also use the program, albeit with possible restrictions. However, I hope that the PWA will experience its breakthrough in the next few years and that Apple will be forced to support this technology more and more.</w:t>
       </w:r>
     </w:p>
     <w:p>
@@ -821,11 +859,16 @@
         <w:t>,</w:t>
       </w:r>
       <w:r>
-        <w:t xml:space="preserve"> habe ich diese Aufgabe</w:t>
+        <w:t xml:space="preserve"> habe ich diese </w:t>
+      </w:r>
+      <w:proofErr w:type="gramStart"/>
+      <w:r>
+        <w:t>Aufgabe</w:t>
       </w:r>
       <w:r>
         <w:t xml:space="preserve"> quasi</w:t>
       </w:r>
+      <w:proofErr w:type="gramEnd"/>
       <w:r>
         <w:t xml:space="preserve"> an Google </w:t>
       </w:r>
@@ -866,11 +909,19 @@
           <w:lang w:val="en-GB"/>
         </w:rPr>
       </w:pPr>
-      <w:r>
-        <w:rPr>
-          <w:lang w:val="en-GB"/>
-        </w:rPr>
-        <w:t>In order to deal with the backend as little as possible, I have virtually outsourced this task to Google. With Firebase, Google offers a variety of functionalities, such as hosting, authentication, database systems and much more. In addition, the use of Firebase is free up to a certain data consumption and therefore ideal for the small budget of a student.</w:t>
+      <w:proofErr w:type="gramStart"/>
+      <w:r>
+        <w:rPr>
+          <w:lang w:val="en-GB"/>
+        </w:rPr>
+        <w:t>In order to</w:t>
+      </w:r>
+      <w:proofErr w:type="gramEnd"/>
+      <w:r>
+        <w:rPr>
+          <w:lang w:val="en-GB"/>
+        </w:rPr>
+        <w:t xml:space="preserve"> deal with the backend as little as possible, I have virtually outsourced this task to Google. With Firebase, Google offers a variety of functionalities, such as hosting, authentication, database systems and much more. In addition, the use of Firebase is free up to a certain data consumption and therefore ideal for the small budget of a student.</w:t>
       </w:r>
     </w:p>
     <w:p>
@@ -1090,7 +1141,21 @@
         <w:rPr>
           <w:lang w:val="en-GB"/>
         </w:rPr>
-        <w:t xml:space="preserve">The audio functions are implemented using the Web Audio API. I have also already used the new audio worklet technology. This is much more performant than the outdated script processor method, because it is executed off the main thread. This means the audio process can't interfere with the rendering of the page. </w:t>
+        <w:t xml:space="preserve">The audio functions are implemented using the Web Audio API. I have also already used the new audio worklet technology. This is much more performant than the outdated script processor </w:t>
+      </w:r>
+      <w:proofErr w:type="gramStart"/>
+      <w:r>
+        <w:rPr>
+          <w:lang w:val="en-GB"/>
+        </w:rPr>
+        <w:t>method, because</w:t>
+      </w:r>
+      <w:proofErr w:type="gramEnd"/>
+      <w:r>
+        <w:rPr>
+          <w:lang w:val="en-GB"/>
+        </w:rPr>
+        <w:t xml:space="preserve"> it is executed off the main thread. This means the audio process can't interfere with the rendering of the page. </w:t>
       </w:r>
     </w:p>
     <w:p>
@@ -1212,7 +1277,21 @@
         <w:rPr>
           <w:bCs/>
         </w:rPr>
-        <w:t xml:space="preserve">Die Anmeldung kann über Email und Passwort oder über Google erfolgen. Da man </w:t>
+        <w:t xml:space="preserve">Die Anmeldung kann über </w:t>
+      </w:r>
+      <w:proofErr w:type="gramStart"/>
+      <w:r>
+        <w:rPr>
+          <w:bCs/>
+        </w:rPr>
+        <w:t>Email</w:t>
+      </w:r>
+      <w:proofErr w:type="gramEnd"/>
+      <w:r>
+        <w:rPr>
+          <w:bCs/>
+        </w:rPr>
+        <w:t xml:space="preserve"> und Passwort oder über Google erfolgen. Da man </w:t>
       </w:r>
       <w:proofErr w:type="spellStart"/>
       <w:r>
@@ -1377,7 +1456,23 @@
           <w:bCs/>
           <w:lang w:val="en-GB"/>
         </w:rPr>
-        <w:t xml:space="preserve">Already saved projects are sorted by the last edit and displayed in PROJECTS. If there is already audio in it, you can listen to it in a first mix. To create new projects you can click on the big plus above. </w:t>
+        <w:t xml:space="preserve">Already saved projects are sorted by the last edit and displayed in PROJECTS. If there is already audio in it, you can listen to it in a first mix. To create new </w:t>
+      </w:r>
+      <w:proofErr w:type="gramStart"/>
+      <w:r>
+        <w:rPr>
+          <w:bCs/>
+          <w:lang w:val="en-GB"/>
+        </w:rPr>
+        <w:t>projects</w:t>
+      </w:r>
+      <w:proofErr w:type="gramEnd"/>
+      <w:r>
+        <w:rPr>
+          <w:bCs/>
+          <w:lang w:val="en-GB"/>
+        </w:rPr>
+        <w:t xml:space="preserve"> you can click on the big plus above. </w:t>
       </w:r>
     </w:p>
     <w:p>
@@ -1393,7 +1488,23 @@
           <w:lang w:val="en-GB"/>
         </w:rPr>
         <w:lastRenderedPageBreak/>
-        <w:t xml:space="preserve">QUICKACTIONS contains quick recordings that can be listened to. To create such a file you can click on the big R in the middle below. Projects can be made from all </w:t>
+        <w:t xml:space="preserve">QUICKACTIONS contains quick recordings that can be listened to. To create such a </w:t>
+      </w:r>
+      <w:proofErr w:type="gramStart"/>
+      <w:r>
+        <w:rPr>
+          <w:bCs/>
+          <w:lang w:val="en-GB"/>
+        </w:rPr>
+        <w:t>file</w:t>
+      </w:r>
+      <w:proofErr w:type="gramEnd"/>
+      <w:r>
+        <w:rPr>
+          <w:bCs/>
+          <w:lang w:val="en-GB"/>
+        </w:rPr>
+        <w:t xml:space="preserve"> you can click on the big R in the middle below. Projects can be made from all </w:t>
       </w:r>
       <w:proofErr w:type="spellStart"/>
       <w:r>
@@ -1951,6 +2062,7 @@
         </w:rPr>
         <w:t xml:space="preserve">omescreen auf „PROJECTS“ wird er hierher weitergeleitet. Oben können die Alben eingesehen werden. Und unten sind die bereits bestehenden Projekte, geordnet nach Alphabet. </w:t>
       </w:r>
+      <w:proofErr w:type="gramStart"/>
       <w:r>
         <w:rPr>
           <w:bCs/>
@@ -1961,7 +2073,14 @@
         <w:rPr>
           <w:bCs/>
         </w:rPr>
-        <w:t>ittels Klick öffnet sich das jeweilige Projekt und mittels Drag and Drop lässt es sich entweder löschen (Mülleimer) oder in ein Album einsortieren.</w:t>
+        <w:t>ittels Klick</w:t>
+      </w:r>
+      <w:proofErr w:type="gramEnd"/>
+      <w:r>
+        <w:rPr>
+          <w:bCs/>
+        </w:rPr>
+        <w:t xml:space="preserve"> öffnet sich das jeweilige Projekt und mittels Drag and Drop lässt es sich entweder löschen (Mülleimer) oder in ein Album einsortieren.</w:t>
       </w:r>
     </w:p>
     <w:p>
@@ -2846,10 +2965,12 @@
         <w:t xml:space="preserve">echsel der Tonart ändert sich nicht nur die Auswahl in der </w:t>
       </w:r>
       <w:proofErr w:type="spellStart"/>
+      <w:proofErr w:type="gramStart"/>
       <w:r>
         <w:t>Akkordetastatur</w:t>
       </w:r>
       <w:proofErr w:type="spellEnd"/>
+      <w:proofErr w:type="gramEnd"/>
       <w:r>
         <w:t xml:space="preserve"> sondern auch alle Akkorde auf dem Leadsheet.</w:t>
       </w:r>

</xml_diff>